<commit_message>
feat: v3.2.3 — one-command setup scripts for new users
Adds setup.sh (macOS/Linux) and setup.ps1 (Windows) that bootstrap a
new machine end to end: install uv if missing, install Python 3.13 and
all dependencies via uv sync, verify the CLI, and offer to launch the
config wizard. No pre-installed Python or uv required; idempotent.

This removes the manual venv/dependency setup that was blocking
first-time internal testers.

setup.sh runs from its own directory (works when double-clicked or
run from any cwd) and tested end-to-end locally. setup.ps1 mirrors it
for Windows PowerShell.

Docs: README Step 1 and Operations Runbook §1.2 now lead with the
one-command setup (manual path kept as a fallback); fixed a stale
3.1.0 version reference in the runbook verification step. Docs-only
and repo-root scripts — the wheel is unchanged from v3.2.2.

Co-Authored-By: Claude Opus 4.8 <noreply@anthropic.com>
</commit_message>
<xml_diff>
--- a/docs/operations-runbook.docx
+++ b/docs/operations-runbook.docx
@@ -477,20 +477,22 @@
         </w:rPr>
         <w:t xml:space="preserve"> anaplan-audit-with-history</w:t>
       </w:r>
-      <w:r>
-        <w:br/>
-      </w:r>
-      <w:r>
-        <w:rPr>
-          <w:rStyle w:val="ExtensionTok"/>
-        </w:rPr>
-        <w:t xml:space="preserve">uv</w:t>
-      </w:r>
-      <w:r>
-        <w:rPr>
-          <w:rStyle w:val="NormalTok"/>
-        </w:rPr>
-        <w:t xml:space="preserve"> sync</w:t>
+    </w:p>
+    <w:p>
+      <w:pPr>
+        <w:numPr>
+          <w:ilvl w:val="0"/>
+          <w:numId w:val="1000"/>
+        </w:numPr>
+      </w:pPr>
+      <w:r>
+        <w:t xml:space="preserve">(Or download the source zip from the latest GitHub release and unzip</w:t>
+      </w:r>
+      <w:r>
+        <w:t xml:space="preserve"> </w:t>
+      </w:r>
+      <w:r>
+        <w:t xml:space="preserve">it — no git required.)</w:t>
       </w:r>
     </w:p>
     <w:p>
@@ -501,7 +503,41 @@
         </w:numPr>
       </w:pPr>
       <w:r>
-        <w:t xml:space="preserve">Copy and configure settings:</w:t>
+        <w:rPr>
+          <w:b/>
+          <w:bCs/>
+        </w:rPr>
+        <w:t xml:space="preserve">Recommended — one-command setup.</w:t>
+      </w:r>
+      <w:r>
+        <w:t xml:space="preserve"> </w:t>
+      </w:r>
+      <w:r>
+        <w:t xml:space="preserve">From the project folder, run the</w:t>
+      </w:r>
+      <w:r>
+        <w:t xml:space="preserve"> </w:t>
+      </w:r>
+      <w:r>
+        <w:t xml:space="preserve">bootstrap script for your platform. It installs</w:t>
+      </w:r>
+      <w:r>
+        <w:t xml:space="preserve"> </w:t>
+      </w:r>
+      <w:r>
+        <w:rPr>
+          <w:rStyle w:val="VerbatimChar"/>
+        </w:rPr>
+        <w:t xml:space="preserve">uv</w:t>
+      </w:r>
+      <w:r>
+        <w:t xml:space="preserve">, Python 3.13,</w:t>
+      </w:r>
+      <w:r>
+        <w:t xml:space="preserve"> </w:t>
+      </w:r>
+      <w:r>
+        <w:t xml:space="preserve">and all dependencies, then offers to launch the config wizard:</w:t>
       </w:r>
     </w:p>
     <w:p>
@@ -516,31 +552,117 @@
         <w:rPr>
           <w:rStyle w:val="FunctionTok"/>
         </w:rPr>
-        <w:t xml:space="preserve">cp</w:t>
-      </w:r>
-      <w:r>
-        <w:rPr>
-          <w:rStyle w:val="NormalTok"/>
-        </w:rPr>
-        <w:t xml:space="preserve"> settings.json.example settings.json</w:t>
+        <w:t xml:space="preserve">bash</w:t>
+      </w:r>
+      <w:r>
+        <w:rPr>
+          <w:rStyle w:val="NormalTok"/>
+        </w:rPr>
+        <w:t xml:space="preserve"> setup.sh                                          </w:t>
+      </w:r>
+      <w:r>
+        <w:rPr>
+          <w:rStyle w:val="CommentTok"/>
+        </w:rPr>
+        <w:t xml:space="preserve"># macOS / Linux</w:t>
       </w:r>
       <w:r>
         <w:br/>
       </w:r>
       <w:r>
         <w:rPr>
+          <w:rStyle w:val="ExtensionTok"/>
+        </w:rPr>
+        <w:t xml:space="preserve">powershell</w:t>
+      </w:r>
+      <w:r>
+        <w:rPr>
+          <w:rStyle w:val="NormalTok"/>
+        </w:rPr>
+        <w:t xml:space="preserve"> </w:t>
+      </w:r>
+      <w:r>
+        <w:rPr>
+          <w:rStyle w:val="AttributeTok"/>
+        </w:rPr>
+        <w:t xml:space="preserve">-ExecutionPolicy</w:t>
+      </w:r>
+      <w:r>
+        <w:rPr>
+          <w:rStyle w:val="NormalTok"/>
+        </w:rPr>
+        <w:t xml:space="preserve"> Bypass </w:t>
+      </w:r>
+      <w:r>
+        <w:rPr>
+          <w:rStyle w:val="AttributeTok"/>
+        </w:rPr>
+        <w:t xml:space="preserve">-File</w:t>
+      </w:r>
+      <w:r>
+        <w:rPr>
+          <w:rStyle w:val="NormalTok"/>
+        </w:rPr>
+        <w:t xml:space="preserve"> setup.ps1     </w:t>
+      </w:r>
+      <w:r>
+        <w:rPr>
           <w:rStyle w:val="CommentTok"/>
         </w:rPr>
-        <w:t xml:space="preserve"># Edit settings.json — see Section 2 for authentication and</w:t>
-      </w:r>
-      <w:r>
-        <w:br/>
-      </w:r>
-      <w:r>
-        <w:rPr>
-          <w:rStyle w:val="CommentTok"/>
-        </w:rPr>
-        <w:t xml:space="preserve"># the Technical Reference for the full field list</w:t>
+        <w:t xml:space="preserve"># Windows</w:t>
+      </w:r>
+    </w:p>
+    <w:p>
+      <w:pPr>
+        <w:numPr>
+          <w:ilvl w:val="0"/>
+          <w:numId w:val="1000"/>
+        </w:numPr>
+      </w:pPr>
+      <w:r>
+        <w:t xml:space="preserve">The script is idempotent (safe to re-run) and needs no pre-installed</w:t>
+      </w:r>
+      <w:r>
+        <w:t xml:space="preserve"> </w:t>
+      </w:r>
+      <w:r>
+        <w:t xml:space="preserve">Python or</w:t>
+      </w:r>
+      <w:r>
+        <w:t xml:space="preserve"> </w:t>
+      </w:r>
+      <w:r>
+        <w:rPr>
+          <w:rStyle w:val="VerbatimChar"/>
+        </w:rPr>
+        <w:t xml:space="preserve">uv</w:t>
+      </w:r>
+      <w:r>
+        <w:t xml:space="preserve">. To do it manually instead:</w:t>
+      </w:r>
+      <w:r>
+        <w:t xml:space="preserve"> </w:t>
+      </w:r>
+      <w:r>
+        <w:rPr>
+          <w:rStyle w:val="VerbatimChar"/>
+        </w:rPr>
+        <w:t xml:space="preserve">uv sync</w:t>
+      </w:r>
+      <w:r>
+        <w:t xml:space="preserve">, then</w:t>
+      </w:r>
+      <w:r>
+        <w:t xml:space="preserve"> </w:t>
+      </w:r>
+      <w:r>
+        <w:rPr>
+          <w:rStyle w:val="VerbatimChar"/>
+        </w:rPr>
+        <w:t xml:space="preserve">cp settings.json.example settings.json</w:t>
+      </w:r>
+      <w:r>
+        <w:t xml:space="preserve">.</w:t>
       </w:r>
     </w:p>
     <w:p>
@@ -551,7 +673,7 @@
         </w:numPr>
       </w:pPr>
       <w:r>
-        <w:t xml:space="preserve">Validate configuration:</w:t>
+        <w:t xml:space="preserve">Configure and validate:</w:t>
       </w:r>
     </w:p>
     <w:p>
@@ -572,7 +694,34 @@
         <w:rPr>
           <w:rStyle w:val="NormalTok"/>
         </w:rPr>
-        <w:t xml:space="preserve"> run anaplan-audit validate-config</w:t>
+        <w:t xml:space="preserve"> run anaplan-audit init             </w:t>
+      </w:r>
+      <w:r>
+        <w:rPr>
+          <w:rStyle w:val="CommentTok"/>
+        </w:rPr>
+        <w:t xml:space="preserve"># interactive config wizard</w:t>
+      </w:r>
+      <w:r>
+        <w:br/>
+      </w:r>
+      <w:r>
+        <w:rPr>
+          <w:rStyle w:val="ExtensionTok"/>
+        </w:rPr>
+        <w:t xml:space="preserve">uv</w:t>
+      </w:r>
+      <w:r>
+        <w:rPr>
+          <w:rStyle w:val="NormalTok"/>
+        </w:rPr>
+        <w:t xml:space="preserve"> run anaplan-audit validate-config  </w:t>
+      </w:r>
+      <w:r>
+        <w:rPr>
+          <w:rStyle w:val="CommentTok"/>
+        </w:rPr>
+        <w:t xml:space="preserve"># confirm settings + auth</w:t>
       </w:r>
     </w:p>
     <w:p>
@@ -634,17 +783,29 @@
         <w:rPr>
           <w:rStyle w:val="AttributeTok"/>
         </w:rPr>
+        <w:t xml:space="preserve">--limit</w:t>
+      </w:r>
+      <w:r>
+        <w:rPr>
+          <w:rStyle w:val="NormalTok"/>
+        </w:rPr>
+        <w:t xml:space="preserve"> 500 </w:t>
+      </w:r>
+      <w:r>
+        <w:rPr>
+          <w:rStyle w:val="AttributeTok"/>
+        </w:rPr>
         <w:t xml:space="preserve">--verbose</w:t>
       </w:r>
     </w:p>
     <w:bookmarkEnd w:id="11"/>
-    <w:bookmarkStart w:id="12" w:name="X846a55e8d4813f484c57107ad6d74df51973ad3"/>
+    <w:bookmarkStart w:id="12" w:name="X4ef600a683e739a785d0c7c254f1453c1ce6d99"/>
     <w:p>
       <w:pPr>
         <w:pStyle w:val="Heading2"/>
       </w:pPr>
       <w:r>
-        <w:t xml:space="preserve">1.3 Verify the v3.1 release is installed</w:t>
+        <w:t xml:space="preserve">1.3 Verify the release is installed</w:t>
       </w:r>
     </w:p>
     <w:p>
@@ -670,7 +831,7 @@
         <w:rPr>
           <w:rStyle w:val="CommentTok"/>
         </w:rPr>
-        <w:t xml:space="preserve"># anaplan-audit-history 3.1.0</w:t>
+        <w:t xml:space="preserve"># anaplan-audit-history 3.2.2</w:t>
       </w:r>
     </w:p>
     <w:p>

</xml_diff>